<commit_message>
udpate notes of IELTS reading
</commit_message>
<xml_diff>
--- a/IELTS Notes/Reading Test and Analyses.docx
+++ b/IELTS Notes/Reading Test and Analyses.docx
@@ -50,7 +50,7 @@
       <w:pPr>
         <w:outlineLvl w:val="2"/>
         <w:rPr>
-          <w:rFonts w:ascii="Times New Roman" w:hAnsi="Times New Roman" w:cs="Times New Roman"/>
+          <w:rFonts w:ascii="Times New Roman" w:hAnsi="Times New Roman" w:cs="Times New Roman" w:hint="eastAsia"/>
           <w:b/>
           <w:bCs/>
           <w:sz w:val="32"/>
@@ -91,251 +91,11 @@
           <w:sz w:val="28"/>
           <w:szCs w:val="28"/>
         </w:rPr>
-        <w:t>Passage 3</w:t>
-      </w:r>
-    </w:p>
-    <w:p>
-      <w:pPr>
-        <w:rPr>
-          <w:rFonts w:ascii="Times New Roman" w:hAnsi="Times New Roman" w:cs="Times New Roman"/>
-        </w:rPr>
-      </w:pPr>
-      <w:r>
-        <w:rPr>
-          <w:rFonts w:ascii="Times New Roman" w:hAnsi="Times New Roman" w:cs="Times New Roman" w:hint="eastAsia"/>
-        </w:rPr>
-        <w:t>30.</w:t>
-      </w:r>
-      <w:r>
-        <w:rPr>
-          <w:rFonts w:ascii="Times New Roman" w:hAnsi="Times New Roman" w:cs="Times New Roman" w:hint="eastAsia"/>
-        </w:rPr>
-        <w:t xml:space="preserve"> a</w:t>
-      </w:r>
-      <w:r>
-        <w:rPr>
-          <w:rFonts w:ascii="Times New Roman" w:hAnsi="Times New Roman" w:cs="Times New Roman"/>
-        </w:rPr>
-        <w:t xml:space="preserve"> description of the mental activities which are exercised and developed during play</w:t>
-      </w:r>
-    </w:p>
-    <w:p>
-      <w:pPr>
-        <w:rPr>
-          <w:rFonts w:ascii="Times New Roman" w:hAnsi="Times New Roman" w:cs="Times New Roman"/>
-        </w:rPr>
-      </w:pPr>
-      <w:r>
-        <w:rPr>
-          <w:rFonts w:ascii="Times New Roman" w:hAnsi="Times New Roman" w:cs="Times New Roman" w:hint="eastAsia"/>
-          <w:strike/>
-        </w:rPr>
-        <w:t>E</w:t>
-      </w:r>
-      <w:r>
-        <w:rPr>
-          <w:rFonts w:ascii="Times New Roman" w:hAnsi="Times New Roman" w:cs="Times New Roman" w:hint="eastAsia"/>
-        </w:rPr>
-        <w:t xml:space="preserve"> (H)</w:t>
-      </w:r>
-    </w:p>
-    <w:p>
-      <w:pPr>
-        <w:rPr>
-          <w:rFonts w:ascii="Times New Roman" w:hAnsi="Times New Roman" w:cs="Times New Roman"/>
-        </w:rPr>
-      </w:pPr>
-      <w:r>
-        <w:rPr>
-          <w:rFonts w:ascii="Times New Roman" w:hAnsi="Times New Roman" w:cs="Times New Roman" w:hint="eastAsia"/>
-        </w:rPr>
-        <w:t xml:space="preserve">Paragraph E describes the brain size and play. Apparently, </w:t>
-      </w:r>
-      <w:r>
-        <w:rPr>
-          <w:rFonts w:ascii="Times New Roman" w:hAnsi="Times New Roman" w:cs="Times New Roman" w:hint="eastAsia"/>
-        </w:rPr>
-        <w:t>we should find out which paragrapsh is related to the key words, mental activities.</w:t>
-      </w:r>
-      <w:r>
-        <w:rPr>
-          <w:rFonts w:ascii="Times New Roman" w:hAnsi="Times New Roman" w:cs="Times New Roman" w:hint="eastAsia"/>
-        </w:rPr>
-        <w:t xml:space="preserve"> Whereas, in IELTS exams </w:t>
-      </w:r>
-      <w:r>
-        <w:rPr>
-          <w:rFonts w:ascii="Times New Roman" w:hAnsi="Times New Roman" w:cs="Times New Roman" w:hint="eastAsia"/>
-        </w:rPr>
-        <w:t>we</w:t>
-      </w:r>
-      <w:r>
-        <w:rPr>
-          <w:rFonts w:ascii="Times New Roman" w:hAnsi="Times New Roman" w:cs="Times New Roman" w:hint="eastAsia"/>
-        </w:rPr>
-        <w:t xml:space="preserve"> can hardly find the same words as in the questions</w:t>
-      </w:r>
-      <w:r>
-        <w:rPr>
-          <w:rFonts w:ascii="Times New Roman" w:hAnsi="Times New Roman" w:cs="Times New Roman" w:hint="eastAsia"/>
-        </w:rPr>
-        <w:t xml:space="preserve"> so we need to paraphrase. </w:t>
-      </w:r>
-      <w:r>
-        <w:rPr>
-          <w:rFonts w:ascii="Times New Roman" w:hAnsi="Times New Roman" w:cs="Times New Roman" w:hint="eastAsia"/>
-        </w:rPr>
-        <w:t xml:space="preserve">In paragraph H, the words </w:t>
-      </w:r>
-      <w:r>
-        <w:rPr>
-          <w:rFonts w:ascii="Times New Roman" w:hAnsi="Times New Roman" w:cs="Times New Roman"/>
-        </w:rPr>
-        <w:t>“</w:t>
-      </w:r>
-      <w:r>
-        <w:rPr>
-          <w:rFonts w:ascii="Times New Roman" w:hAnsi="Times New Roman" w:cs="Times New Roman" w:hint="eastAsia"/>
-        </w:rPr>
-        <w:t>cognitive process</w:t>
-      </w:r>
-      <w:r>
-        <w:rPr>
-          <w:rFonts w:ascii="Times New Roman" w:hAnsi="Times New Roman" w:cs="Times New Roman"/>
-        </w:rPr>
-        <w:t>”</w:t>
-      </w:r>
-      <w:r>
-        <w:rPr>
-          <w:rFonts w:ascii="Times New Roman" w:hAnsi="Times New Roman" w:cs="Times New Roman" w:hint="eastAsia"/>
-        </w:rPr>
-        <w:t xml:space="preserve"> are sycronyms of </w:t>
-      </w:r>
-      <w:r>
-        <w:rPr>
-          <w:rFonts w:ascii="Times New Roman" w:hAnsi="Times New Roman" w:cs="Times New Roman"/>
-        </w:rPr>
-        <w:t>“</w:t>
-      </w:r>
-      <w:r>
-        <w:rPr>
-          <w:rFonts w:ascii="Times New Roman" w:hAnsi="Times New Roman" w:cs="Times New Roman" w:hint="eastAsia"/>
-        </w:rPr>
-        <w:t>metal activities</w:t>
-      </w:r>
-      <w:r>
-        <w:rPr>
-          <w:rFonts w:ascii="Times New Roman" w:hAnsi="Times New Roman" w:cs="Times New Roman"/>
-        </w:rPr>
-        <w:t>”</w:t>
-      </w:r>
-      <w:r>
-        <w:rPr>
-          <w:rFonts w:ascii="Times New Roman" w:hAnsi="Times New Roman" w:cs="Times New Roman" w:hint="eastAsia"/>
-        </w:rPr>
-        <w:t>.</w:t>
-      </w:r>
-      <w:r>
-        <w:rPr>
-          <w:rFonts w:ascii="Times New Roman" w:hAnsi="Times New Roman" w:cs="Times New Roman" w:hint="eastAsia"/>
-        </w:rPr>
-        <w:t xml:space="preserve"> </w:t>
-      </w:r>
-    </w:p>
-    <w:p>
-      <w:pPr>
-        <w:rPr>
-          <w:rFonts w:ascii="Times New Roman" w:hAnsi="Times New Roman" w:cs="Times New Roman"/>
-          <w:lang w:val="de-DE"/>
-        </w:rPr>
-      </w:pPr>
-      <w:r>
-        <w:rPr>
-          <w:rFonts w:ascii="Times New Roman" w:hAnsi="Times New Roman" w:cs="Times New Roman" w:hint="eastAsia"/>
-        </w:rPr>
-        <w:t xml:space="preserve">33-35. </w:t>
-      </w:r>
-      <w:r>
-        <w:rPr>
-          <w:rFonts w:ascii="Times New Roman" w:hAnsi="Times New Roman" w:cs="Times New Roman" w:hint="eastAsia"/>
-          <w:strike/>
-          <w:lang w:val="de-DE"/>
-        </w:rPr>
-        <w:t>BD</w:t>
-      </w:r>
-      <w:r>
-        <w:rPr>
-          <w:rFonts w:ascii="Times New Roman" w:hAnsi="Times New Roman" w:cs="Times New Roman" w:hint="eastAsia"/>
-          <w:lang w:val="de-DE"/>
-        </w:rPr>
-        <w:t>F (ACF)</w:t>
-      </w:r>
-    </w:p>
-    <w:p>
-      <w:pPr>
-        <w:rPr>
-          <w:rFonts w:ascii="Times New Roman" w:hAnsi="Times New Roman" w:cs="Times New Roman"/>
-          <w:lang w:val="de-DE"/>
-        </w:rPr>
-      </w:pPr>
-      <w:r>
-        <w:rPr>
-          <w:rFonts w:ascii="Times New Roman" w:hAnsi="Times New Roman" w:cs="Times New Roman" w:hint="eastAsia"/>
-          <w:lang w:val="de-DE"/>
-        </w:rPr>
-        <w:t xml:space="preserve">38. </w:t>
-      </w:r>
-      <w:r>
-        <w:rPr>
-          <w:rFonts w:ascii="Times New Roman" w:hAnsi="Times New Roman" w:cs="Times New Roman" w:hint="eastAsia"/>
-          <w:strike/>
-          <w:lang w:val="de-DE"/>
-        </w:rPr>
-        <w:t>C</w:t>
-      </w:r>
-      <w:r>
-        <w:rPr>
-          <w:rFonts w:ascii="Times New Roman" w:hAnsi="Times New Roman" w:cs="Times New Roman" w:hint="eastAsia"/>
-          <w:lang w:val="de-DE"/>
-        </w:rPr>
-        <w:t xml:space="preserve"> (E)</w:t>
-      </w:r>
-    </w:p>
-    <w:p>
-      <w:pPr>
-        <w:rPr>
-          <w:rFonts w:ascii="Times New Roman" w:hAnsi="Times New Roman" w:cs="Times New Roman"/>
-          <w:lang w:val="de-DE"/>
-        </w:rPr>
-      </w:pPr>
-    </w:p>
-    <w:p>
-      <w:pPr>
-        <w:outlineLvl w:val="2"/>
-        <w:rPr>
-          <w:rFonts w:ascii="Times New Roman" w:hAnsi="Times New Roman" w:cs="Times New Roman"/>
-          <w:b/>
-          <w:bCs/>
-          <w:sz w:val="32"/>
-          <w:szCs w:val="32"/>
-        </w:rPr>
-      </w:pPr>
-      <w:r>
-        <w:rPr>
-          <w:rFonts w:ascii="Times New Roman" w:hAnsi="Times New Roman" w:cs="Times New Roman" w:hint="eastAsia"/>
-          <w:b/>
-          <w:bCs/>
-          <w:sz w:val="32"/>
-          <w:szCs w:val="32"/>
-        </w:rPr>
-        <w:t>Test 4</w:t>
-      </w:r>
-    </w:p>
-    <w:p>
-      <w:pPr>
-        <w:outlineLvl w:val="3"/>
-        <w:rPr>
-          <w:rFonts w:ascii="Times New Roman" w:hAnsi="Times New Roman" w:cs="Times New Roman"/>
+        <w:t>Passage</w:t>
+      </w:r>
+      <w:r>
+        <w:rPr>
+          <w:rFonts w:ascii="Times New Roman" w:hAnsi="Times New Roman" w:cs="Times New Roman" w:hint="eastAsia"/>
           <w:b/>
           <w:bCs/>
           <w:i/>
@@ -343,10 +103,72 @@
           <w:sz w:val="28"/>
           <w:szCs w:val="28"/>
         </w:rPr>
-      </w:pPr>
-      <w:r>
-        <w:rPr>
-          <w:rFonts w:ascii="Times New Roman" w:hAnsi="Times New Roman" w:cs="Times New Roman" w:hint="eastAsia"/>
+        <w:t xml:space="preserve"> 1</w:t>
+      </w:r>
+    </w:p>
+    <w:p>
+      <w:pPr>
+        <w:rPr>
+          <w:rFonts w:ascii="Times New Roman" w:hAnsi="Times New Roman" w:cs="Times New Roman" w:hint="eastAsia"/>
+        </w:rPr>
+      </w:pPr>
+      <w:r>
+        <w:rPr>
+          <w:rFonts w:ascii="Times New Roman" w:hAnsi="Times New Roman" w:cs="Times New Roman" w:hint="eastAsia"/>
+        </w:rPr>
+        <w:t>9. E  (x) B</w:t>
+      </w:r>
+    </w:p>
+    <w:p>
+      <w:pPr>
+        <w:rPr>
+          <w:rFonts w:ascii="Times New Roman" w:hAnsi="Times New Roman" w:cs="Times New Roman"/>
+        </w:rPr>
+      </w:pPr>
+      <w:r>
+        <w:rPr>
+          <w:rFonts w:ascii="Times New Roman" w:hAnsi="Times New Roman" w:cs="Times New Roman" w:hint="eastAsia"/>
+        </w:rPr>
+        <w:t xml:space="preserve">The first sentence of the seventh paragraph is related to </w:t>
+      </w:r>
+      <w:r>
+        <w:rPr>
+          <w:rFonts w:ascii="Times New Roman" w:hAnsi="Times New Roman" w:cs="Times New Roman"/>
+        </w:rPr>
+        <w:t>“</w:t>
+      </w:r>
+      <w:r>
+        <w:rPr>
+          <w:rFonts w:ascii="Times New Roman" w:hAnsi="Times New Roman" w:cs="Times New Roman" w:hint="eastAsia"/>
+        </w:rPr>
+        <w:t>culture</w:t>
+      </w:r>
+      <w:r>
+        <w:rPr>
+          <w:rFonts w:ascii="Times New Roman" w:hAnsi="Times New Roman" w:cs="Times New Roman"/>
+        </w:rPr>
+        <w:t>”</w:t>
+      </w:r>
+      <w:r>
+        <w:rPr>
+          <w:rFonts w:ascii="Times New Roman" w:hAnsi="Times New Roman" w:cs="Times New Roman" w:hint="eastAsia"/>
+        </w:rPr>
+        <w:t>.</w:t>
+      </w:r>
+      <w:r>
+        <w:rPr>
+          <w:rFonts w:ascii="Times New Roman" w:hAnsi="Times New Roman" w:cs="Times New Roman" w:hint="eastAsia"/>
+        </w:rPr>
+        <w:t xml:space="preserve"> </w:t>
+      </w:r>
+      <w:bookmarkStart w:id="0" w:name="_GoBack"/>
+      <w:bookmarkEnd w:id="0"/>
+    </w:p>
+    <w:p>
+      <w:pPr>
+        <w:outlineLvl w:val="3"/>
+        <w:rPr>
+          <w:rFonts w:ascii="Times New Roman" w:hAnsi="Times New Roman" w:cs="Times New Roman"/>
           <w:b/>
           <w:bCs/>
           <w:i/>
@@ -354,235 +176,10 @@
           <w:sz w:val="28"/>
           <w:szCs w:val="28"/>
         </w:rPr>
-        <w:t>Passage 1</w:t>
-      </w:r>
-    </w:p>
-    <w:p>
-      <w:pPr>
-        <w:rPr>
-          <w:rFonts w:ascii="Times New Roman" w:hAnsi="Times New Roman" w:cs="Times New Roman"/>
-        </w:rPr>
-      </w:pPr>
-      <w:r>
-        <w:rPr>
-          <w:rFonts w:ascii="Times New Roman" w:hAnsi="Times New Roman" w:cs="Times New Roman" w:hint="eastAsia"/>
-        </w:rPr>
-        <w:t xml:space="preserve">5. TRUE  (x)  </w:t>
-      </w:r>
-      <w:r>
-        <w:rPr>
-          <w:rFonts w:ascii="Times New Roman" w:hAnsi="Times New Roman" w:cs="Times New Roman" w:hint="eastAsia"/>
-        </w:rPr>
-        <w:t xml:space="preserve"> </w:t>
-      </w:r>
-      <w:r>
-        <w:rPr>
-          <w:rFonts w:ascii="Times New Roman" w:hAnsi="Times New Roman" w:cs="Times New Roman" w:hint="eastAsia"/>
-        </w:rPr>
-        <w:t>NOT GIVEN</w:t>
-      </w:r>
-    </w:p>
-    <w:p>
-      <w:pPr>
-        <w:rPr>
-          <w:rFonts w:ascii="Times New Roman" w:hAnsi="Times New Roman" w:cs="Times New Roman"/>
-        </w:rPr>
-      </w:pPr>
-      <w:r>
-        <w:rPr>
-          <w:rFonts w:ascii="Times New Roman" w:hAnsi="Times New Roman" w:cs="Times New Roman" w:hint="eastAsia"/>
-        </w:rPr>
-        <w:t xml:space="preserve">The author only wrote that an athlete mush choose his parents carefully. </w:t>
-      </w:r>
-      <w:r>
-        <w:rPr>
-          <w:rFonts w:ascii="Times New Roman" w:hAnsi="Times New Roman" w:cs="Times New Roman" w:hint="eastAsia"/>
-        </w:rPr>
-        <w:t>There was</w:t>
-      </w:r>
-      <w:r>
-        <w:rPr>
-          <w:rFonts w:ascii="Times New Roman" w:hAnsi="Times New Roman" w:cs="Times New Roman" w:hint="eastAsia"/>
-        </w:rPr>
-        <w:t xml:space="preserve"> not any infor</w:t>
-      </w:r>
-      <w:r>
-        <w:rPr>
-          <w:rFonts w:ascii="Times New Roman" w:hAnsi="Times New Roman" w:cs="Times New Roman" w:hint="eastAsia"/>
-        </w:rPr>
-        <w:t>mation about who his parents were</w:t>
-      </w:r>
-      <w:r>
-        <w:rPr>
-          <w:rFonts w:ascii="Times New Roman" w:hAnsi="Times New Roman" w:cs="Times New Roman" w:hint="eastAsia"/>
-        </w:rPr>
-        <w:t>.</w:t>
-      </w:r>
-    </w:p>
-    <w:p>
-      <w:pPr>
-        <w:rPr>
-          <w:rFonts w:ascii="Times New Roman" w:hAnsi="Times New Roman" w:cs="Times New Roman"/>
-        </w:rPr>
-      </w:pPr>
-      <w:r>
-        <w:rPr>
-          <w:rFonts w:ascii="Times New Roman" w:hAnsi="Times New Roman" w:cs="Times New Roman" w:hint="eastAsia"/>
-        </w:rPr>
-        <w:t>8. plyometrics (x)  power</w:t>
-      </w:r>
-      <w:r>
-        <w:rPr>
-          <w:rFonts w:ascii="Times New Roman" w:hAnsi="Times New Roman" w:cs="Times New Roman"/>
-        </w:rPr>
-        <w:br/>
-      </w:r>
-      <w:r>
-        <w:rPr>
-          <w:rFonts w:ascii="Times New Roman" w:hAnsi="Times New Roman" w:cs="Times New Roman" w:hint="eastAsia"/>
-        </w:rPr>
-        <w:t>I didn</w:t>
-      </w:r>
-      <w:r>
-        <w:rPr>
-          <w:rFonts w:ascii="Times New Roman" w:hAnsi="Times New Roman" w:cs="Times New Roman"/>
-        </w:rPr>
-        <w:t>’</w:t>
-      </w:r>
-      <w:r>
-        <w:rPr>
-          <w:rFonts w:ascii="Times New Roman" w:hAnsi="Times New Roman" w:cs="Times New Roman" w:hint="eastAsia"/>
-        </w:rPr>
-        <w:t xml:space="preserve">t know what the meaning of </w:t>
-      </w:r>
-      <w:r>
-        <w:rPr>
-          <w:rFonts w:ascii="Times New Roman" w:hAnsi="Times New Roman" w:cs="Times New Roman"/>
-        </w:rPr>
-        <w:t>‘</w:t>
-      </w:r>
-      <w:r>
-        <w:rPr>
-          <w:rFonts w:ascii="Times New Roman" w:hAnsi="Times New Roman" w:cs="Times New Roman" w:hint="eastAsia"/>
-        </w:rPr>
-        <w:t>plyometrics</w:t>
-      </w:r>
-      <w:r>
-        <w:rPr>
-          <w:rFonts w:ascii="Times New Roman" w:hAnsi="Times New Roman" w:cs="Times New Roman"/>
-        </w:rPr>
-        <w:t>’</w:t>
-      </w:r>
-      <w:r>
-        <w:rPr>
-          <w:rFonts w:ascii="Times New Roman" w:hAnsi="Times New Roman" w:cs="Times New Roman" w:hint="eastAsia"/>
-        </w:rPr>
-        <w:t xml:space="preserve"> </w:t>
-      </w:r>
-      <w:r>
-        <w:rPr>
-          <w:rFonts w:ascii="Times New Roman" w:hAnsi="Times New Roman" w:cs="Times New Roman" w:hint="eastAsia"/>
-        </w:rPr>
-        <w:t>was then.</w:t>
-      </w:r>
-      <w:r>
-        <w:rPr>
-          <w:rFonts w:ascii="Times New Roman" w:hAnsi="Times New Roman" w:cs="Times New Roman"/>
-        </w:rPr>
-        <w:br/>
-      </w:r>
-      <w:r>
-        <w:rPr>
-          <w:rFonts w:ascii="Times New Roman" w:hAnsi="Times New Roman" w:cs="Times New Roman" w:hint="eastAsia"/>
-        </w:rPr>
-        <w:t>The</w:t>
-      </w:r>
-      <w:r>
-        <w:rPr>
-          <w:rFonts w:ascii="Times New Roman" w:hAnsi="Times New Roman" w:cs="Times New Roman" w:hint="eastAsia"/>
-        </w:rPr>
-        <w:t xml:space="preserve"> emritus professior Yessis said, </w:t>
-      </w:r>
-      <w:r>
-        <w:rPr>
-          <w:rFonts w:ascii="Times New Roman" w:hAnsi="Times New Roman" w:cs="Times New Roman"/>
-        </w:rPr>
-        <w:t>“</w:t>
-      </w:r>
-      <w:r>
-        <w:rPr>
-          <w:rFonts w:ascii="Times New Roman" w:hAnsi="Times New Roman" w:cs="Times New Roman" w:hint="eastAsia"/>
-        </w:rPr>
-        <w:t>These methods inculde strength training...</w:t>
-      </w:r>
-      <w:r>
-        <w:rPr>
-          <w:rFonts w:ascii="Times New Roman" w:hAnsi="Times New Roman" w:cs="Times New Roman"/>
-        </w:rPr>
-        <w:t>”</w:t>
-      </w:r>
-      <w:r>
-        <w:rPr>
-          <w:rFonts w:ascii="Times New Roman" w:hAnsi="Times New Roman" w:cs="Times New Roman" w:hint="eastAsia"/>
-        </w:rPr>
-        <w:t xml:space="preserve"> and </w:t>
-      </w:r>
-      <w:r>
-        <w:rPr>
-          <w:rFonts w:ascii="Times New Roman" w:hAnsi="Times New Roman" w:cs="Times New Roman"/>
-        </w:rPr>
-        <w:t>“</w:t>
-      </w:r>
-      <w:r>
-        <w:rPr>
-          <w:rFonts w:ascii="Times New Roman" w:hAnsi="Times New Roman" w:cs="Times New Roman" w:hint="eastAsia"/>
-        </w:rPr>
-        <w:t>plyometrics focuses on power.</w:t>
-      </w:r>
-      <w:r>
-        <w:rPr>
-          <w:rFonts w:ascii="Times New Roman" w:hAnsi="Times New Roman" w:cs="Times New Roman"/>
-        </w:rPr>
-        <w:t>”</w:t>
-      </w:r>
-    </w:p>
-    <w:p>
-      <w:pPr>
-        <w:rPr>
-          <w:rFonts w:ascii="Times New Roman" w:hAnsi="Times New Roman" w:cs="Times New Roman" w:hint="eastAsia"/>
-        </w:rPr>
-      </w:pPr>
-      <w:r>
-        <w:rPr>
-          <w:rFonts w:ascii="Times New Roman" w:hAnsi="Times New Roman" w:cs="Times New Roman" w:hint="eastAsia"/>
-        </w:rPr>
-        <w:t>9. ____ (x)   injuries</w:t>
-      </w:r>
-      <w:r>
-        <w:rPr>
-          <w:rFonts w:ascii="Times New Roman" w:hAnsi="Times New Roman" w:cs="Times New Roman"/>
-        </w:rPr>
-        <w:br/>
-        <w:t>“de</w:t>
-      </w:r>
-      <w:r>
-        <w:rPr>
-          <w:rFonts w:ascii="Times New Roman" w:hAnsi="Times New Roman" w:cs="Times New Roman" w:hint="eastAsia"/>
-        </w:rPr>
-        <w:t>ficiencies in trace minerals can lead to injuries.</w:t>
-      </w:r>
-      <w:r>
-        <w:rPr>
-          <w:rFonts w:ascii="Times New Roman" w:hAnsi="Times New Roman" w:cs="Times New Roman"/>
-        </w:rPr>
-        <w:t>”</w:t>
-      </w:r>
-    </w:p>
-    <w:p>
-      <w:pPr>
-        <w:outlineLvl w:val="3"/>
-        <w:rPr>
-          <w:rFonts w:ascii="Times New Roman" w:hAnsi="Times New Roman" w:cs="Times New Roman" w:hint="eastAsia"/>
+      </w:pPr>
+      <w:r>
+        <w:rPr>
+          <w:rFonts w:ascii="Times New Roman" w:hAnsi="Times New Roman" w:cs="Times New Roman"/>
           <w:b/>
           <w:bCs/>
           <w:i/>
@@ -590,10 +187,251 @@
           <w:sz w:val="28"/>
           <w:szCs w:val="28"/>
         </w:rPr>
-      </w:pPr>
-      <w:r>
-        <w:rPr>
-          <w:rFonts w:ascii="Times New Roman" w:hAnsi="Times New Roman" w:cs="Times New Roman" w:hint="eastAsia"/>
+        <w:t>Passage 3</w:t>
+      </w:r>
+    </w:p>
+    <w:p>
+      <w:pPr>
+        <w:rPr>
+          <w:rFonts w:ascii="Times New Roman" w:hAnsi="Times New Roman" w:cs="Times New Roman"/>
+        </w:rPr>
+      </w:pPr>
+      <w:r>
+        <w:rPr>
+          <w:rFonts w:ascii="Times New Roman" w:hAnsi="Times New Roman" w:cs="Times New Roman" w:hint="eastAsia"/>
+        </w:rPr>
+        <w:t>30.</w:t>
+      </w:r>
+      <w:r>
+        <w:rPr>
+          <w:rFonts w:ascii="Times New Roman" w:hAnsi="Times New Roman" w:cs="Times New Roman" w:hint="eastAsia"/>
+        </w:rPr>
+        <w:t xml:space="preserve"> a</w:t>
+      </w:r>
+      <w:r>
+        <w:rPr>
+          <w:rFonts w:ascii="Times New Roman" w:hAnsi="Times New Roman" w:cs="Times New Roman"/>
+        </w:rPr>
+        <w:t xml:space="preserve"> description of the mental activities which are exercised and developed during play</w:t>
+      </w:r>
+    </w:p>
+    <w:p>
+      <w:pPr>
+        <w:rPr>
+          <w:rFonts w:ascii="Times New Roman" w:hAnsi="Times New Roman" w:cs="Times New Roman"/>
+        </w:rPr>
+      </w:pPr>
+      <w:r>
+        <w:rPr>
+          <w:rFonts w:ascii="Times New Roman" w:hAnsi="Times New Roman" w:cs="Times New Roman" w:hint="eastAsia"/>
+          <w:strike/>
+        </w:rPr>
+        <w:t>E</w:t>
+      </w:r>
+      <w:r>
+        <w:rPr>
+          <w:rFonts w:ascii="Times New Roman" w:hAnsi="Times New Roman" w:cs="Times New Roman" w:hint="eastAsia"/>
+        </w:rPr>
+        <w:t xml:space="preserve"> (H)</w:t>
+      </w:r>
+    </w:p>
+    <w:p>
+      <w:pPr>
+        <w:rPr>
+          <w:rFonts w:ascii="Times New Roman" w:hAnsi="Times New Roman" w:cs="Times New Roman"/>
+        </w:rPr>
+      </w:pPr>
+      <w:r>
+        <w:rPr>
+          <w:rFonts w:ascii="Times New Roman" w:hAnsi="Times New Roman" w:cs="Times New Roman" w:hint="eastAsia"/>
+        </w:rPr>
+        <w:t xml:space="preserve">Paragraph E describes the brain size and play. Apparently, </w:t>
+      </w:r>
+      <w:r>
+        <w:rPr>
+          <w:rFonts w:ascii="Times New Roman" w:hAnsi="Times New Roman" w:cs="Times New Roman" w:hint="eastAsia"/>
+        </w:rPr>
+        <w:t>we should find out which paragrapsh is related to the key words, mental activities.</w:t>
+      </w:r>
+      <w:r>
+        <w:rPr>
+          <w:rFonts w:ascii="Times New Roman" w:hAnsi="Times New Roman" w:cs="Times New Roman" w:hint="eastAsia"/>
+        </w:rPr>
+        <w:t xml:space="preserve"> Whereas, in IELTS exams </w:t>
+      </w:r>
+      <w:r>
+        <w:rPr>
+          <w:rFonts w:ascii="Times New Roman" w:hAnsi="Times New Roman" w:cs="Times New Roman" w:hint="eastAsia"/>
+        </w:rPr>
+        <w:t>we</w:t>
+      </w:r>
+      <w:r>
+        <w:rPr>
+          <w:rFonts w:ascii="Times New Roman" w:hAnsi="Times New Roman" w:cs="Times New Roman" w:hint="eastAsia"/>
+        </w:rPr>
+        <w:t xml:space="preserve"> can hardly find the same words as in the questions</w:t>
+      </w:r>
+      <w:r>
+        <w:rPr>
+          <w:rFonts w:ascii="Times New Roman" w:hAnsi="Times New Roman" w:cs="Times New Roman" w:hint="eastAsia"/>
+        </w:rPr>
+        <w:t xml:space="preserve"> so we need to paraphrase. </w:t>
+      </w:r>
+      <w:r>
+        <w:rPr>
+          <w:rFonts w:ascii="Times New Roman" w:hAnsi="Times New Roman" w:cs="Times New Roman" w:hint="eastAsia"/>
+        </w:rPr>
+        <w:t xml:space="preserve">In paragraph H, the words </w:t>
+      </w:r>
+      <w:r>
+        <w:rPr>
+          <w:rFonts w:ascii="Times New Roman" w:hAnsi="Times New Roman" w:cs="Times New Roman"/>
+        </w:rPr>
+        <w:t>“</w:t>
+      </w:r>
+      <w:r>
+        <w:rPr>
+          <w:rFonts w:ascii="Times New Roman" w:hAnsi="Times New Roman" w:cs="Times New Roman" w:hint="eastAsia"/>
+        </w:rPr>
+        <w:t>cognitive process</w:t>
+      </w:r>
+      <w:r>
+        <w:rPr>
+          <w:rFonts w:ascii="Times New Roman" w:hAnsi="Times New Roman" w:cs="Times New Roman"/>
+        </w:rPr>
+        <w:t>”</w:t>
+      </w:r>
+      <w:r>
+        <w:rPr>
+          <w:rFonts w:ascii="Times New Roman" w:hAnsi="Times New Roman" w:cs="Times New Roman" w:hint="eastAsia"/>
+        </w:rPr>
+        <w:t xml:space="preserve"> are sycronyms of </w:t>
+      </w:r>
+      <w:r>
+        <w:rPr>
+          <w:rFonts w:ascii="Times New Roman" w:hAnsi="Times New Roman" w:cs="Times New Roman"/>
+        </w:rPr>
+        <w:t>“</w:t>
+      </w:r>
+      <w:r>
+        <w:rPr>
+          <w:rFonts w:ascii="Times New Roman" w:hAnsi="Times New Roman" w:cs="Times New Roman" w:hint="eastAsia"/>
+        </w:rPr>
+        <w:t>metal activities</w:t>
+      </w:r>
+      <w:r>
+        <w:rPr>
+          <w:rFonts w:ascii="Times New Roman" w:hAnsi="Times New Roman" w:cs="Times New Roman"/>
+        </w:rPr>
+        <w:t>”</w:t>
+      </w:r>
+      <w:r>
+        <w:rPr>
+          <w:rFonts w:ascii="Times New Roman" w:hAnsi="Times New Roman" w:cs="Times New Roman" w:hint="eastAsia"/>
+        </w:rPr>
+        <w:t>.</w:t>
+      </w:r>
+      <w:r>
+        <w:rPr>
+          <w:rFonts w:ascii="Times New Roman" w:hAnsi="Times New Roman" w:cs="Times New Roman" w:hint="eastAsia"/>
+        </w:rPr>
+        <w:t xml:space="preserve"> </w:t>
+      </w:r>
+    </w:p>
+    <w:p>
+      <w:pPr>
+        <w:rPr>
+          <w:rFonts w:ascii="Times New Roman" w:hAnsi="Times New Roman" w:cs="Times New Roman"/>
+          <w:lang w:val="de-DE"/>
+        </w:rPr>
+      </w:pPr>
+      <w:r>
+        <w:rPr>
+          <w:rFonts w:ascii="Times New Roman" w:hAnsi="Times New Roman" w:cs="Times New Roman" w:hint="eastAsia"/>
+        </w:rPr>
+        <w:t xml:space="preserve">33-35. </w:t>
+      </w:r>
+      <w:r>
+        <w:rPr>
+          <w:rFonts w:ascii="Times New Roman" w:hAnsi="Times New Roman" w:cs="Times New Roman" w:hint="eastAsia"/>
+          <w:strike/>
+          <w:lang w:val="de-DE"/>
+        </w:rPr>
+        <w:t>BD</w:t>
+      </w:r>
+      <w:r>
+        <w:rPr>
+          <w:rFonts w:ascii="Times New Roman" w:hAnsi="Times New Roman" w:cs="Times New Roman" w:hint="eastAsia"/>
+          <w:lang w:val="de-DE"/>
+        </w:rPr>
+        <w:t>F (ACF)</w:t>
+      </w:r>
+    </w:p>
+    <w:p>
+      <w:pPr>
+        <w:rPr>
+          <w:rFonts w:ascii="Times New Roman" w:hAnsi="Times New Roman" w:cs="Times New Roman"/>
+          <w:lang w:val="de-DE"/>
+        </w:rPr>
+      </w:pPr>
+      <w:r>
+        <w:rPr>
+          <w:rFonts w:ascii="Times New Roman" w:hAnsi="Times New Roman" w:cs="Times New Roman" w:hint="eastAsia"/>
+          <w:lang w:val="de-DE"/>
+        </w:rPr>
+        <w:t xml:space="preserve">38. </w:t>
+      </w:r>
+      <w:r>
+        <w:rPr>
+          <w:rFonts w:ascii="Times New Roman" w:hAnsi="Times New Roman" w:cs="Times New Roman" w:hint="eastAsia"/>
+          <w:strike/>
+          <w:lang w:val="de-DE"/>
+        </w:rPr>
+        <w:t>C</w:t>
+      </w:r>
+      <w:r>
+        <w:rPr>
+          <w:rFonts w:ascii="Times New Roman" w:hAnsi="Times New Roman" w:cs="Times New Roman" w:hint="eastAsia"/>
+          <w:lang w:val="de-DE"/>
+        </w:rPr>
+        <w:t xml:space="preserve"> (E)</w:t>
+      </w:r>
+    </w:p>
+    <w:p>
+      <w:pPr>
+        <w:rPr>
+          <w:rFonts w:ascii="Times New Roman" w:hAnsi="Times New Roman" w:cs="Times New Roman"/>
+          <w:lang w:val="de-DE"/>
+        </w:rPr>
+      </w:pPr>
+    </w:p>
+    <w:p>
+      <w:pPr>
+        <w:outlineLvl w:val="2"/>
+        <w:rPr>
+          <w:rFonts w:ascii="Times New Roman" w:hAnsi="Times New Roman" w:cs="Times New Roman"/>
+          <w:b/>
+          <w:bCs/>
+          <w:sz w:val="32"/>
+          <w:szCs w:val="32"/>
+        </w:rPr>
+      </w:pPr>
+      <w:r>
+        <w:rPr>
+          <w:rFonts w:ascii="Times New Roman" w:hAnsi="Times New Roman" w:cs="Times New Roman" w:hint="eastAsia"/>
+          <w:b/>
+          <w:bCs/>
+          <w:sz w:val="32"/>
+          <w:szCs w:val="32"/>
+        </w:rPr>
+        <w:t>Test 4</w:t>
+      </w:r>
+    </w:p>
+    <w:p>
+      <w:pPr>
+        <w:outlineLvl w:val="3"/>
+        <w:rPr>
+          <w:rFonts w:ascii="Times New Roman" w:hAnsi="Times New Roman" w:cs="Times New Roman"/>
           <w:b/>
           <w:bCs/>
           <w:i/>
@@ -601,13 +439,271 @@
           <w:sz w:val="28"/>
           <w:szCs w:val="28"/>
         </w:rPr>
+      </w:pPr>
+      <w:r>
+        <w:rPr>
+          <w:rFonts w:ascii="Times New Roman" w:hAnsi="Times New Roman" w:cs="Times New Roman" w:hint="eastAsia"/>
+          <w:b/>
+          <w:bCs/>
+          <w:i/>
+          <w:iCs/>
+          <w:sz w:val="28"/>
+          <w:szCs w:val="28"/>
+        </w:rPr>
+        <w:t>Passage 1</w:t>
+      </w:r>
+    </w:p>
+    <w:p>
+      <w:pPr>
+        <w:rPr>
+          <w:rFonts w:ascii="Times New Roman" w:hAnsi="Times New Roman" w:cs="Times New Roman"/>
+        </w:rPr>
+      </w:pPr>
+      <w:r>
+        <w:rPr>
+          <w:rFonts w:ascii="Times New Roman" w:hAnsi="Times New Roman" w:cs="Times New Roman" w:hint="eastAsia"/>
+        </w:rPr>
+        <w:t xml:space="preserve">5. TRUE  (x)  </w:t>
+      </w:r>
+      <w:r>
+        <w:rPr>
+          <w:rFonts w:ascii="Times New Roman" w:hAnsi="Times New Roman" w:cs="Times New Roman" w:hint="eastAsia"/>
+        </w:rPr>
+        <w:t xml:space="preserve"> </w:t>
+      </w:r>
+      <w:r>
+        <w:rPr>
+          <w:rFonts w:ascii="Times New Roman" w:hAnsi="Times New Roman" w:cs="Times New Roman" w:hint="eastAsia"/>
+        </w:rPr>
+        <w:t>NOT GIVEN</w:t>
+      </w:r>
+    </w:p>
+    <w:p>
+      <w:pPr>
+        <w:rPr>
+          <w:rFonts w:ascii="Times New Roman" w:hAnsi="Times New Roman" w:cs="Times New Roman"/>
+        </w:rPr>
+      </w:pPr>
+      <w:r>
+        <w:rPr>
+          <w:rFonts w:ascii="Times New Roman" w:hAnsi="Times New Roman" w:cs="Times New Roman" w:hint="eastAsia"/>
+        </w:rPr>
+        <w:t xml:space="preserve">The author only wrote that an athlete mush choose his parents carefully. </w:t>
+      </w:r>
+      <w:r>
+        <w:rPr>
+          <w:rFonts w:ascii="Times New Roman" w:hAnsi="Times New Roman" w:cs="Times New Roman" w:hint="eastAsia"/>
+        </w:rPr>
+        <w:t>There was</w:t>
+      </w:r>
+      <w:r>
+        <w:rPr>
+          <w:rFonts w:ascii="Times New Roman" w:hAnsi="Times New Roman" w:cs="Times New Roman" w:hint="eastAsia"/>
+        </w:rPr>
+        <w:t xml:space="preserve"> not any infor</w:t>
+      </w:r>
+      <w:r>
+        <w:rPr>
+          <w:rFonts w:ascii="Times New Roman" w:hAnsi="Times New Roman" w:cs="Times New Roman" w:hint="eastAsia"/>
+        </w:rPr>
+        <w:t>mation about who his parents were</w:t>
+      </w:r>
+      <w:r>
+        <w:rPr>
+          <w:rFonts w:ascii="Times New Roman" w:hAnsi="Times New Roman" w:cs="Times New Roman" w:hint="eastAsia"/>
+        </w:rPr>
+        <w:t>.</w:t>
+      </w:r>
+    </w:p>
+    <w:p>
+      <w:pPr>
+        <w:rPr>
+          <w:rFonts w:ascii="Times New Roman" w:hAnsi="Times New Roman" w:cs="Times New Roman"/>
+        </w:rPr>
+      </w:pPr>
+      <w:r>
+        <w:rPr>
+          <w:rFonts w:ascii="Times New Roman" w:hAnsi="Times New Roman" w:cs="Times New Roman" w:hint="eastAsia"/>
+        </w:rPr>
+        <w:t>8. plyometrics (x)  power</w:t>
+      </w:r>
+      <w:r>
+        <w:rPr>
+          <w:rFonts w:ascii="Times New Roman" w:hAnsi="Times New Roman" w:cs="Times New Roman"/>
+        </w:rPr>
+        <w:br/>
+      </w:r>
+      <w:r>
+        <w:rPr>
+          <w:rFonts w:ascii="Times New Roman" w:hAnsi="Times New Roman" w:cs="Times New Roman" w:hint="eastAsia"/>
+        </w:rPr>
+        <w:t>I didn</w:t>
+      </w:r>
+      <w:r>
+        <w:rPr>
+          <w:rFonts w:ascii="Times New Roman" w:hAnsi="Times New Roman" w:cs="Times New Roman"/>
+        </w:rPr>
+        <w:t>’</w:t>
+      </w:r>
+      <w:r>
+        <w:rPr>
+          <w:rFonts w:ascii="Times New Roman" w:hAnsi="Times New Roman" w:cs="Times New Roman" w:hint="eastAsia"/>
+        </w:rPr>
+        <w:t xml:space="preserve">t know what the meaning of </w:t>
+      </w:r>
+      <w:r>
+        <w:rPr>
+          <w:rFonts w:ascii="Times New Roman" w:hAnsi="Times New Roman" w:cs="Times New Roman"/>
+        </w:rPr>
+        <w:t>‘</w:t>
+      </w:r>
+      <w:r>
+        <w:rPr>
+          <w:rFonts w:ascii="Times New Roman" w:hAnsi="Times New Roman" w:cs="Times New Roman" w:hint="eastAsia"/>
+        </w:rPr>
+        <w:t>plyometrics</w:t>
+      </w:r>
+      <w:r>
+        <w:rPr>
+          <w:rFonts w:ascii="Times New Roman" w:hAnsi="Times New Roman" w:cs="Times New Roman"/>
+        </w:rPr>
+        <w:t>’</w:t>
+      </w:r>
+      <w:r>
+        <w:rPr>
+          <w:rFonts w:ascii="Times New Roman" w:hAnsi="Times New Roman" w:cs="Times New Roman" w:hint="eastAsia"/>
+        </w:rPr>
+        <w:t xml:space="preserve"> </w:t>
+      </w:r>
+      <w:r>
+        <w:rPr>
+          <w:rFonts w:ascii="Times New Roman" w:hAnsi="Times New Roman" w:cs="Times New Roman" w:hint="eastAsia"/>
+        </w:rPr>
+        <w:t>was then.</w:t>
+      </w:r>
+      <w:r>
+        <w:rPr>
+          <w:rFonts w:ascii="Times New Roman" w:hAnsi="Times New Roman" w:cs="Times New Roman"/>
+        </w:rPr>
+        <w:br/>
+      </w:r>
+      <w:r>
+        <w:rPr>
+          <w:rFonts w:ascii="Times New Roman" w:hAnsi="Times New Roman" w:cs="Times New Roman" w:hint="eastAsia"/>
+        </w:rPr>
+        <w:t>The</w:t>
+      </w:r>
+      <w:r>
+        <w:rPr>
+          <w:rFonts w:ascii="Times New Roman" w:hAnsi="Times New Roman" w:cs="Times New Roman" w:hint="eastAsia"/>
+        </w:rPr>
+        <w:t xml:space="preserve"> emritus professior Yessis said, </w:t>
+      </w:r>
+      <w:r>
+        <w:rPr>
+          <w:rFonts w:ascii="Times New Roman" w:hAnsi="Times New Roman" w:cs="Times New Roman"/>
+        </w:rPr>
+        <w:t>“</w:t>
+      </w:r>
+      <w:r>
+        <w:rPr>
+          <w:rFonts w:ascii="Times New Roman" w:hAnsi="Times New Roman" w:cs="Times New Roman" w:hint="eastAsia"/>
+        </w:rPr>
+        <w:t>These methods inculde strength training...</w:t>
+      </w:r>
+      <w:r>
+        <w:rPr>
+          <w:rFonts w:ascii="Times New Roman" w:hAnsi="Times New Roman" w:cs="Times New Roman"/>
+        </w:rPr>
+        <w:t>”</w:t>
+      </w:r>
+      <w:r>
+        <w:rPr>
+          <w:rFonts w:ascii="Times New Roman" w:hAnsi="Times New Roman" w:cs="Times New Roman" w:hint="eastAsia"/>
+        </w:rPr>
+        <w:t xml:space="preserve"> and </w:t>
+      </w:r>
+      <w:r>
+        <w:rPr>
+          <w:rFonts w:ascii="Times New Roman" w:hAnsi="Times New Roman" w:cs="Times New Roman"/>
+        </w:rPr>
+        <w:t>“</w:t>
+      </w:r>
+      <w:r>
+        <w:rPr>
+          <w:rFonts w:ascii="Times New Roman" w:hAnsi="Times New Roman" w:cs="Times New Roman" w:hint="eastAsia"/>
+        </w:rPr>
+        <w:t>plyometrics focuses on power.</w:t>
+      </w:r>
+      <w:r>
+        <w:rPr>
+          <w:rFonts w:ascii="Times New Roman" w:hAnsi="Times New Roman" w:cs="Times New Roman"/>
+        </w:rPr>
+        <w:t>”</w:t>
+      </w:r>
+    </w:p>
+    <w:p>
+      <w:pPr>
+        <w:rPr>
+          <w:rFonts w:ascii="Times New Roman" w:hAnsi="Times New Roman" w:cs="Times New Roman"/>
+        </w:rPr>
+      </w:pPr>
+      <w:r>
+        <w:rPr>
+          <w:rFonts w:ascii="Times New Roman" w:hAnsi="Times New Roman" w:cs="Times New Roman" w:hint="eastAsia"/>
+        </w:rPr>
+        <w:t>9. ____ (x)   injuries</w:t>
+      </w:r>
+      <w:r>
+        <w:rPr>
+          <w:rFonts w:ascii="Times New Roman" w:hAnsi="Times New Roman" w:cs="Times New Roman"/>
+        </w:rPr>
+        <w:br/>
+        <w:t>“de</w:t>
+      </w:r>
+      <w:r>
+        <w:rPr>
+          <w:rFonts w:ascii="Times New Roman" w:hAnsi="Times New Roman" w:cs="Times New Roman" w:hint="eastAsia"/>
+        </w:rPr>
+        <w:t>ficiencies in trace minerals can lead to injuries.</w:t>
+      </w:r>
+      <w:r>
+        <w:rPr>
+          <w:rFonts w:ascii="Times New Roman" w:hAnsi="Times New Roman" w:cs="Times New Roman"/>
+        </w:rPr>
+        <w:t>”</w:t>
+      </w:r>
+    </w:p>
+    <w:p>
+      <w:pPr>
+        <w:outlineLvl w:val="3"/>
+        <w:rPr>
+          <w:rFonts w:ascii="Times New Roman" w:hAnsi="Times New Roman" w:cs="Times New Roman"/>
+          <w:b/>
+          <w:bCs/>
+          <w:i/>
+          <w:iCs/>
+          <w:sz w:val="28"/>
+          <w:szCs w:val="28"/>
+        </w:rPr>
+      </w:pPr>
+      <w:r>
+        <w:rPr>
+          <w:rFonts w:ascii="Times New Roman" w:hAnsi="Times New Roman" w:cs="Times New Roman" w:hint="eastAsia"/>
+          <w:b/>
+          <w:bCs/>
+          <w:i/>
+          <w:iCs/>
+          <w:sz w:val="28"/>
+          <w:szCs w:val="28"/>
+        </w:rPr>
         <w:t>Passage 2</w:t>
       </w:r>
     </w:p>
     <w:p>
       <w:pPr>
         <w:rPr>
-          <w:rFonts w:ascii="Times New Roman" w:hAnsi="Times New Roman" w:cs="Times New Roman" w:hint="eastAsia"/>
+          <w:rFonts w:ascii="Times New Roman" w:hAnsi="Times New Roman" w:cs="Times New Roman"/>
         </w:rPr>
       </w:pPr>
       <w:r>
@@ -656,7 +752,7 @@
     <w:p>
       <w:pPr>
         <w:rPr>
-          <w:rFonts w:ascii="Times New Roman" w:hAnsi="Times New Roman" w:cs="Times New Roman" w:hint="eastAsia"/>
+          <w:rFonts w:ascii="Times New Roman" w:hAnsi="Times New Roman" w:cs="Times New Roman"/>
         </w:rPr>
       </w:pPr>
       <w:r>
@@ -681,7 +777,7 @@
     <w:p>
       <w:pPr>
         <w:rPr>
-          <w:rFonts w:ascii="Times New Roman" w:hAnsi="Times New Roman" w:cs="Times New Roman" w:hint="eastAsia"/>
+          <w:rFonts w:ascii="Times New Roman" w:hAnsi="Times New Roman" w:cs="Times New Roman"/>
         </w:rPr>
       </w:pPr>
       <w:r>
@@ -694,13 +790,14 @@
     <w:p>
       <w:pPr>
         <w:rPr>
-          <w:rFonts w:ascii="Times New Roman" w:hAnsi="Times New Roman" w:cs="Times New Roman" w:hint="eastAsia"/>
-        </w:rPr>
-      </w:pPr>
-      <w:r>
-        <w:rPr>
-          <w:rFonts w:ascii="Times New Roman" w:hAnsi="Times New Roman" w:cs="Times New Roman" w:hint="eastAsia"/>
-        </w:rPr>
+          <w:rFonts w:ascii="Times New Roman" w:hAnsi="Times New Roman" w:cs="Times New Roman"/>
+        </w:rPr>
+      </w:pPr>
+      <w:r>
+        <w:rPr>
+          <w:rFonts w:ascii="Times New Roman" w:hAnsi="Times New Roman" w:cs="Times New Roman" w:hint="eastAsia"/>
+        </w:rPr>
+        <w:lastRenderedPageBreak/>
         <w:t>31. vii  (x)  v</w:t>
       </w:r>
       <w:r>
@@ -743,7 +840,7 @@
     <w:p>
       <w:pPr>
         <w:rPr>
-          <w:rFonts w:ascii="Times New Roman" w:hAnsi="Times New Roman" w:cs="Times New Roman" w:hint="eastAsia"/>
+          <w:rFonts w:ascii="Times New Roman" w:hAnsi="Times New Roman" w:cs="Times New Roman"/>
         </w:rPr>
       </w:pPr>
       <w:r>
@@ -786,14 +883,13 @@
     <w:p>
       <w:pPr>
         <w:rPr>
-          <w:rFonts w:ascii="Times New Roman" w:hAnsi="Times New Roman" w:cs="Times New Roman" w:hint="eastAsia"/>
-        </w:rPr>
-      </w:pPr>
-      <w:r>
-        <w:rPr>
-          <w:rFonts w:ascii="Times New Roman" w:hAnsi="Times New Roman" w:cs="Times New Roman" w:hint="eastAsia"/>
-        </w:rPr>
-        <w:lastRenderedPageBreak/>
+          <w:rFonts w:ascii="Times New Roman" w:hAnsi="Times New Roman" w:cs="Times New Roman"/>
+        </w:rPr>
+      </w:pPr>
+      <w:r>
+        <w:rPr>
+          <w:rFonts w:ascii="Times New Roman" w:hAnsi="Times New Roman" w:cs="Times New Roman" w:hint="eastAsia"/>
+        </w:rPr>
         <w:t>37. NOT GIVEN  (x)  YES</w:t>
       </w:r>
       <w:r>
@@ -812,7 +908,7 @@
     <w:p>
       <w:pPr>
         <w:rPr>
-          <w:rFonts w:ascii="Times New Roman" w:hAnsi="Times New Roman" w:cs="Times New Roman" w:hint="eastAsia"/>
+          <w:rFonts w:ascii="Times New Roman" w:hAnsi="Times New Roman" w:cs="Times New Roman"/>
         </w:rPr>
       </w:pPr>
       <w:r>
@@ -843,7 +939,7 @@
     <w:p>
       <w:pPr>
         <w:rPr>
-          <w:rFonts w:ascii="Times New Roman" w:hAnsi="Times New Roman" w:cs="Times New Roman" w:hint="eastAsia"/>
+          <w:rFonts w:ascii="Times New Roman" w:hAnsi="Times New Roman" w:cs="Times New Roman"/>
         </w:rPr>
       </w:pPr>
       <w:r>
@@ -906,8 +1002,6 @@
         </w:rPr>
         <w:t xml:space="preserve">It just said that health costs will continue to increase. </w:t>
       </w:r>
-      <w:bookmarkStart w:id="0" w:name="_GoBack"/>
-      <w:bookmarkEnd w:id="0"/>
     </w:p>
     <w:p>
       <w:pPr>
@@ -2831,7 +2925,7 @@
   <a:extraClrSchemeLst/>
   <a:extLst>
     <a:ext uri="{05A4C25C-085E-4340-85A3-A5531E510DB2}">
-      <thm15:themeFamily xmlns:thm15="http://schemas.microsoft.com/office/thememl/2012/main" xmlns="" name="Office Theme" id="{62F939B6-93AF-4DB8-9C6B-D6C7DFDC589F}" vid="{4A3C46E8-61CC-4603-A589-7422A47A8E4A}"/>
+      <thm15:themeFamily xmlns="" xmlns:thm15="http://schemas.microsoft.com/office/thememl/2012/main" name="Office Theme" id="{62F939B6-93AF-4DB8-9C6B-D6C7DFDC589F}" vid="{4A3C46E8-61CC-4603-A589-7422A47A8E4A}"/>
     </a:ext>
   </a:extLst>
 </a:theme>

</xml_diff>